<commit_message>
fix: final-review findings (clause splitter, model switching, data-driven report text, URL/PDF edge cases, tests)
</commit_message>
<xml_diff>
--- a/reports/ClauseGuard_Report.docx
+++ b/reports/ClauseGuard_Report.docx
@@ -770,90 +770,6 @@
         <w:spacing w:after="60" w:before="0"/>
       </w:pPr>
     </w:p>
-    <w:tbl>
-      <w:tblPr>
-        <w:tblW w:type="auto" w:w="0"/>
-        <w:jc w:val="center"/>
-        <w:tblLook w:firstColumn="1" w:firstRow="1" w:lastColumn="0" w:lastRow="0" w:noHBand="0" w:noVBand="1" w:val="04A0"/>
-        <w:tblBorders>
-          <w:top w:val="single" w:sz="4" w:color="C3CBD6"/>
-          <w:left w:val="nil"/>
-          <w:bottom w:val="single" w:sz="4" w:color="C3CBD6"/>
-          <w:right w:val="nil"/>
-          <w:insideH w:val="nil"/>
-          <w:insideV w:val="nil"/>
-        </w:tblBorders>
-      </w:tblPr>
-      <w:tblGrid>
-        <w:gridCol w:w="4876"/>
-        <w:gridCol w:w="4876"/>
-      </w:tblGrid>
-      <w:tr>
-        <w:tc>
-          <w:tcPr>
-            <w:tcW w:type="dxa" w:w="4876"/>
-          </w:tcPr>
-          <w:p>
-            <w:pPr>
-              <w:jc w:val="center"/>
-            </w:pPr>
-          </w:p>
-        </w:tc>
-        <w:tc>
-          <w:tcPr>
-            <w:tcW w:type="dxa" w:w="4876"/>
-          </w:tcPr>
-          <w:p>
-            <w:pPr>
-              <w:jc w:val="center"/>
-            </w:pPr>
-          </w:p>
-        </w:tc>
-      </w:tr>
-      <w:tr>
-        <w:tc>
-          <w:tcPr>
-            <w:tcW w:type="dxa" w:w="4876"/>
-          </w:tcPr>
-          <w:p>
-            <w:pPr>
-              <w:jc w:val="center"/>
-            </w:pPr>
-            <w:r>
-              <w:rPr>
-                <w:i/>
-                <w:color w:val="3C4F66"/>
-                <w:sz w:val="17"/>
-              </w:rPr>
-              <w:t>Figure 2. Model comparison (test split).</w:t>
-            </w:r>
-          </w:p>
-        </w:tc>
-        <w:tc>
-          <w:tcPr>
-            <w:tcW w:type="dxa" w:w="4876"/>
-          </w:tcPr>
-          <w:p>
-            <w:pPr>
-              <w:jc w:val="center"/>
-            </w:pPr>
-            <w:r>
-              <w:rPr>
-                <w:i/>
-                <w:color w:val="3C4F66"/>
-                <w:sz w:val="17"/>
-              </w:rPr>
-              <w:t>Figure 3. Confusion matrix, TF-IDF + Logistic Regression.</w:t>
-            </w:r>
-          </w:p>
-        </w:tc>
-      </w:tr>
-    </w:tbl>
-    <w:p>
-      <w:pPr>
-        <w:spacing w:after="40" w:before="0"/>
-      </w:pPr>
-    </w:p>
     <w:p>
       <w:pPr>
         <w:spacing w:after="80" w:before="0"/>
@@ -865,7 +781,7 @@
           <w:color w:val="0D253D"/>
           <w:sz w:val="21"/>
         </w:rPr>
-        <w:t>Accuracy is high for every model because about 89% of sentences are fair, so we use macro F1 (all 9 classes weighted equally) as the main metric. TF-IDF + Logistic Regression performs best on macro F1. Per class, it is strongest on Choice of law (F1 0.92) and weakest on Arbitration (F1 0.64, only 7 test sentences). Most errors are unfair clauses predicted as fair, or confusions between closely related types such as jurisdiction and choice of law, which often occur in the same sentence.</w:t>
+        <w:t>Accuracy is high for every model because about 89% of test sentences are fair, so macro F1 (all 9 classes weighted equally) is the main metric. TF-IDF + Logistic Regression was selected for the app because it has the best validation macro F1 (0.718). On the test set TF-IDF + Linear SVM scores slightly higher (0.779 vs 0.775), so the two are close. Per class, it is strongest on Choice of law (F1 0.92) and weakest on Arbitration (F1 0.64, 7 test sentences). For TF-IDF + Logistic Regression, 49 fair sentences were flagged as unfair (false alarms) and 24 unfair sentences were missed. The most common mix-up between unfair types was Unilateral change predicted as Unilateral termination (5 sentences).</w:t>
       </w:r>
     </w:p>
     <w:p>

</xml_diff>

<commit_message>
final: DistilBERT results, charts, Word report, results tables, screenshots, test and e2e proof
</commit_message>
<xml_diff>
--- a/reports/ClauseGuard_Report.docx
+++ b/reports/ClauseGuard_Report.docx
@@ -86,7 +86,7 @@
           <w:color w:val="0D253D"/>
           <w:sz w:val="21"/>
         </w:rPr>
-        <w:t>People routinely accept terms and conditions without reading them. ClauseGuard is an NLP system that reads a document and flags clauses that are potentially unfair to the user. We trained and compared three classifiers on the UNFAIR-ToS dataset (9,414 sentences from 50 online terms of service, 8 unfair-clause types): TF-IDF with Logistic Regression, TF-IDF with a Linear SVM, and a fine-tuned DistilBERT transformer. On the held-out test set the best model (TF-IDF + Logistic Regression) reached a macro F1 of 0.775 and an F1 of 0.802 for separating fair from unfair clauses. The model is deployed in a web app that accepts PDFs, scanned documents, Word files, photos, camera shots, links and pasted text, highlights risky clauses with plain-English explanations and computes a 0–100 risk score.</w:t>
+        <w:t>People routinely accept terms and conditions without reading them. ClauseGuard is an NLP system that reads a document and flags clauses that are potentially unfair to the user. We trained and compared three classifiers on the UNFAIR-ToS dataset (9,414 sentences from 50 online terms of service, 8 unfair-clause types): TF-IDF with Logistic Regression, TF-IDF with a Linear SVM, and a fine-tuned DistilBERT transformer. On the held-out test set the best model (DistilBERT (fine-tuned)) reached a macro F1 of 0.802 and an F1 of 0.797 for separating fair from unfair clauses. The model is deployed in a web app that accepts PDFs, scanned documents, Word files, photos, camera shots, links and pasted text, highlights risky clauses with plain-English explanations and computes a 0–100 risk score.</w:t>
       </w:r>
     </w:p>
     <w:p>
@@ -288,6 +288,28 @@
           <w:color w:val="0D253D"/>
           <w:sz w:val="21"/>
         </w:rPr>
+        <w:t xml:space="preserve">Deep learning: </w:t>
+      </w:r>
+      <w:r>
+        <w:rPr>
+          <w:b w:val="0"/>
+          <w:color w:val="0D253D"/>
+          <w:sz w:val="21"/>
+        </w:rPr>
+        <w:t>DistilBERT (distilbert-base-uncased) fine-tuned for 3 epochs on CPU (AdamW, lr 5e-05, batch 16, max length 128, linear warm-up) with a cross-entropy loss weighted by the square root of the balanced class weights (a deliberately milder form of balancing, so rare classes count more without dominating); the epoch with the best validation macro F1 was kept.</w:t>
+      </w:r>
+    </w:p>
+    <w:p>
+      <w:pPr>
+        <w:pStyle w:val="ListBullet"/>
+        <w:spacing w:after="30"/>
+      </w:pPr>
+      <w:r>
+        <w:rPr>
+          <w:b/>
+          <w:color w:val="0D253D"/>
+          <w:sz w:val="21"/>
+        </w:rPr>
         <w:t xml:space="preserve">Rule checks: </w:t>
       </w:r>
       <w:r>
@@ -502,10 +524,10 @@
           <w:p>
             <w:r>
               <w:rPr>
-                <w:b/>
+                <w:b w:val="0"/>
                 <w:sz w:val="17"/>
               </w:rPr>
-              <w:t>TF-IDF + Logistic Regression (best)</w:t>
+              <w:t>TF-IDF + Logistic Regression</w:t>
             </w:r>
           </w:p>
         </w:tc>
@@ -519,7 +541,7 @@
             </w:pPr>
             <w:r>
               <w:rPr>
-                <w:b/>
+                <w:b w:val="0"/>
                 <w:sz w:val="17"/>
               </w:rPr>
               <w:t>0.946</w:t>
@@ -536,7 +558,7 @@
             </w:pPr>
             <w:r>
               <w:rPr>
-                <w:b/>
+                <w:b w:val="0"/>
                 <w:sz w:val="17"/>
               </w:rPr>
               <w:t>0.736</w:t>
@@ -553,7 +575,7 @@
             </w:pPr>
             <w:r>
               <w:rPr>
-                <w:b/>
+                <w:b w:val="0"/>
                 <w:sz w:val="17"/>
               </w:rPr>
               <w:t>0.845</w:t>
@@ -570,7 +592,7 @@
             </w:pPr>
             <w:r>
               <w:rPr>
-                <w:b/>
+                <w:b w:val="0"/>
                 <w:sz w:val="17"/>
               </w:rPr>
               <w:t>0.775</w:t>
@@ -587,7 +609,7 @@
             </w:pPr>
             <w:r>
               <w:rPr>
-                <w:b/>
+                <w:b w:val="0"/>
                 <w:sz w:val="17"/>
               </w:rPr>
               <w:t>0.750</w:t>
@@ -604,7 +626,7 @@
             </w:pPr>
             <w:r>
               <w:rPr>
-                <w:b/>
+                <w:b w:val="0"/>
                 <w:sz w:val="17"/>
               </w:rPr>
               <w:t>0.802</w:t>
@@ -621,7 +643,7 @@
             </w:pPr>
             <w:r>
               <w:rPr>
-                <w:b/>
+                <w:b w:val="0"/>
                 <w:sz w:val="17"/>
               </w:rPr>
               <w:t>6 s</w:t>
@@ -764,10 +786,297 @@
           </w:p>
         </w:tc>
       </w:tr>
+      <w:tr>
+        <w:tc>
+          <w:tcPr>
+            <w:tcW w:type="dxa" w:w="2608"/>
+          </w:tcPr>
+          <w:p>
+            <w:r>
+              <w:rPr>
+                <w:b/>
+                <w:sz w:val="17"/>
+              </w:rPr>
+              <w:t>DistilBERT (fine-tuned) (best)</w:t>
+            </w:r>
+          </w:p>
+        </w:tc>
+        <w:tc>
+          <w:tcPr>
+            <w:tcW w:type="dxa" w:w="907"/>
+          </w:tcPr>
+          <w:p>
+            <w:pPr>
+              <w:jc w:val="right"/>
+            </w:pPr>
+            <w:r>
+              <w:rPr>
+                <w:b/>
+                <w:sz w:val="17"/>
+              </w:rPr>
+              <w:t>0.948</w:t>
+            </w:r>
+          </w:p>
+        </w:tc>
+        <w:tc>
+          <w:tcPr>
+            <w:tcW w:type="dxa" w:w="850"/>
+          </w:tcPr>
+          <w:p>
+            <w:pPr>
+              <w:jc w:val="right"/>
+            </w:pPr>
+            <w:r>
+              <w:rPr>
+                <w:b/>
+                <w:sz w:val="17"/>
+              </w:rPr>
+              <w:t>0.769</w:t>
+            </w:r>
+          </w:p>
+        </w:tc>
+        <w:tc>
+          <w:tcPr>
+            <w:tcW w:type="dxa" w:w="850"/>
+          </w:tcPr>
+          <w:p>
+            <w:pPr>
+              <w:jc w:val="right"/>
+            </w:pPr>
+            <w:r>
+              <w:rPr>
+                <w:b/>
+                <w:sz w:val="17"/>
+              </w:rPr>
+              <w:t>0.847</w:t>
+            </w:r>
+          </w:p>
+        </w:tc>
+        <w:tc>
+          <w:tcPr>
+            <w:tcW w:type="dxa" w:w="907"/>
+          </w:tcPr>
+          <w:p>
+            <w:pPr>
+              <w:jc w:val="right"/>
+            </w:pPr>
+            <w:r>
+              <w:rPr>
+                <w:b/>
+                <w:sz w:val="17"/>
+              </w:rPr>
+              <w:t>0.802</w:t>
+            </w:r>
+          </w:p>
+        </w:tc>
+        <w:tc>
+          <w:tcPr>
+            <w:tcW w:type="dxa" w:w="1247"/>
+          </w:tcPr>
+          <w:p>
+            <w:pPr>
+              <w:jc w:val="right"/>
+            </w:pPr>
+            <w:r>
+              <w:rPr>
+                <w:b/>
+                <w:sz w:val="17"/>
+              </w:rPr>
+              <w:t>0.780</w:t>
+            </w:r>
+          </w:p>
+        </w:tc>
+        <w:tc>
+          <w:tcPr>
+            <w:tcW w:type="dxa" w:w="1191"/>
+          </w:tcPr>
+          <w:p>
+            <w:pPr>
+              <w:jc w:val="right"/>
+            </w:pPr>
+            <w:r>
+              <w:rPr>
+                <w:b/>
+                <w:sz w:val="17"/>
+              </w:rPr>
+              <w:t>0.797</w:t>
+            </w:r>
+          </w:p>
+        </w:tc>
+        <w:tc>
+          <w:tcPr>
+            <w:tcW w:type="dxa" w:w="964"/>
+          </w:tcPr>
+          <w:p>
+            <w:pPr>
+              <w:jc w:val="right"/>
+            </w:pPr>
+            <w:r>
+              <w:rPr>
+                <w:b/>
+                <w:sz w:val="17"/>
+              </w:rPr>
+              <w:t>69 min</w:t>
+            </w:r>
+          </w:p>
+        </w:tc>
+      </w:tr>
     </w:tbl>
     <w:p>
       <w:pPr>
         <w:spacing w:after="60" w:before="0"/>
+      </w:pPr>
+    </w:p>
+    <w:tbl>
+      <w:tblPr>
+        <w:tblW w:type="auto" w:w="0"/>
+        <w:jc w:val="center"/>
+        <w:tblLook w:firstColumn="1" w:firstRow="1" w:lastColumn="0" w:lastRow="0" w:noHBand="0" w:noVBand="1" w:val="04A0"/>
+        <w:tblBorders>
+          <w:top w:val="single" w:sz="4" w:color="C3CBD6"/>
+          <w:left w:val="nil"/>
+          <w:bottom w:val="single" w:sz="4" w:color="C3CBD6"/>
+          <w:right w:val="nil"/>
+          <w:insideH w:val="nil"/>
+          <w:insideV w:val="nil"/>
+        </w:tblBorders>
+      </w:tblPr>
+      <w:tblGrid>
+        <w:gridCol w:w="4876"/>
+        <w:gridCol w:w="4876"/>
+      </w:tblGrid>
+      <w:tr>
+        <w:tc>
+          <w:tcPr>
+            <w:tcW w:type="dxa" w:w="4876"/>
+          </w:tcPr>
+          <w:p>
+            <w:pPr>
+              <w:jc w:val="center"/>
+            </w:pPr>
+            <w:r>
+              <w:drawing>
+                <wp:inline xmlns:a="http://schemas.openxmlformats.org/drawingml/2006/main" xmlns:pic="http://schemas.openxmlformats.org/drawingml/2006/picture">
+                  <wp:extent cx="3096000" cy="1548000"/>
+                  <wp:docPr id="2" name="Picture 2"/>
+                  <wp:cNvGraphicFramePr>
+                    <a:graphicFrameLocks noChangeAspect="1"/>
+                  </wp:cNvGraphicFramePr>
+                  <a:graphic>
+                    <a:graphicData uri="http://schemas.openxmlformats.org/drawingml/2006/picture">
+                      <pic:pic>
+                        <pic:nvPicPr>
+                          <pic:cNvPr id="0" name="model_comparison.png"/>
+                          <pic:cNvPicPr/>
+                        </pic:nvPicPr>
+                        <pic:blipFill>
+                          <a:blip r:embed="rId10"/>
+                          <a:stretch>
+                            <a:fillRect/>
+                          </a:stretch>
+                        </pic:blipFill>
+                        <pic:spPr>
+                          <a:xfrm>
+                            <a:off x="0" y="0"/>
+                            <a:ext cx="3096000" cy="1548000"/>
+                          </a:xfrm>
+                          <a:prstGeom prst="rect"/>
+                        </pic:spPr>
+                      </pic:pic>
+                    </a:graphicData>
+                  </a:graphic>
+                </wp:inline>
+              </w:drawing>
+            </w:r>
+          </w:p>
+        </w:tc>
+        <w:tc>
+          <w:tcPr>
+            <w:tcW w:type="dxa" w:w="4876"/>
+          </w:tcPr>
+          <w:p>
+            <w:pPr>
+              <w:jc w:val="center"/>
+            </w:pPr>
+            <w:r>
+              <w:drawing>
+                <wp:inline xmlns:a="http://schemas.openxmlformats.org/drawingml/2006/main" xmlns:pic="http://schemas.openxmlformats.org/drawingml/2006/picture">
+                  <wp:extent cx="2736000" cy="2345143"/>
+                  <wp:docPr id="3" name="Picture 3"/>
+                  <wp:cNvGraphicFramePr>
+                    <a:graphicFrameLocks noChangeAspect="1"/>
+                  </wp:cNvGraphicFramePr>
+                  <a:graphic>
+                    <a:graphicData uri="http://schemas.openxmlformats.org/drawingml/2006/picture">
+                      <pic:pic>
+                        <pic:nvPicPr>
+                          <pic:cNvPr id="0" name="confusion_distilbert.png"/>
+                          <pic:cNvPicPr/>
+                        </pic:nvPicPr>
+                        <pic:blipFill>
+                          <a:blip r:embed="rId11"/>
+                          <a:stretch>
+                            <a:fillRect/>
+                          </a:stretch>
+                        </pic:blipFill>
+                        <pic:spPr>
+                          <a:xfrm>
+                            <a:off x="0" y="0"/>
+                            <a:ext cx="2736000" cy="2345143"/>
+                          </a:xfrm>
+                          <a:prstGeom prst="rect"/>
+                        </pic:spPr>
+                      </pic:pic>
+                    </a:graphicData>
+                  </a:graphic>
+                </wp:inline>
+              </w:drawing>
+            </w:r>
+          </w:p>
+        </w:tc>
+      </w:tr>
+      <w:tr>
+        <w:tc>
+          <w:tcPr>
+            <w:tcW w:type="dxa" w:w="4876"/>
+          </w:tcPr>
+          <w:p>
+            <w:pPr>
+              <w:jc w:val="center"/>
+            </w:pPr>
+            <w:r>
+              <w:rPr>
+                <w:i/>
+                <w:color w:val="3C4F66"/>
+                <w:sz w:val="17"/>
+              </w:rPr>
+              <w:t>Figure 2. Model comparison (test split).</w:t>
+            </w:r>
+          </w:p>
+        </w:tc>
+        <w:tc>
+          <w:tcPr>
+            <w:tcW w:type="dxa" w:w="4876"/>
+          </w:tcPr>
+          <w:p>
+            <w:pPr>
+              <w:jc w:val="center"/>
+            </w:pPr>
+            <w:r>
+              <w:rPr>
+                <w:i/>
+                <w:color w:val="3C4F66"/>
+                <w:sz w:val="17"/>
+              </w:rPr>
+              <w:t>Figure 3. Confusion matrix, DistilBERT (fine-tuned).</w:t>
+            </w:r>
+          </w:p>
+        </w:tc>
+      </w:tr>
+    </w:tbl>
+    <w:p>
+      <w:pPr>
+        <w:spacing w:after="40" w:before="0"/>
       </w:pPr>
     </w:p>
     <w:p>
@@ -781,7 +1090,7 @@
           <w:color w:val="0D253D"/>
           <w:sz w:val="21"/>
         </w:rPr>
-        <w:t>Accuracy is high for every model because about 89% of test sentences are fair, so macro F1 (all 9 classes weighted equally) is the main metric. TF-IDF + Logistic Regression was selected for the app because it has the best validation macro F1 (0.718). On the test set TF-IDF + Linear SVM scores slightly higher (0.779 vs 0.775), so the two are close. Per class, it is strongest on Choice of law (F1 0.92) and weakest on Arbitration (F1 0.64, 7 test sentences). For TF-IDF + Logistic Regression, 49 fair sentences were flagged as unfair (false alarms) and 24 unfair sentences were missed. The most common mix-up between unfair types was Unilateral change predicted as Unilateral termination (5 sentences).</w:t>
+        <w:t>Accuracy is high for every model because about 89% of test sentences are fair, so macro F1 (all 9 classes weighted equally) is the main metric. DistilBERT (fine-tuned) was selected for the app because it has the best validation macro F1 (0.744). Per class, it is strongest on Choice of law (F1 0.96) and weakest on Unilateral change (F1 0.64, 38 test sentences). For DistilBERT (fine-tuned), 47 fair sentences were flagged as unfair (false alarms) and 27 unfair sentences were missed. The most common mix-up between unfair types was Unilateral change predicted as Unilateral termination (5 sentences).</w:t>
       </w:r>
     </w:p>
     <w:p>
@@ -805,8 +1114,8 @@
       <w:r>
         <w:drawing>
           <wp:inline xmlns:a="http://schemas.openxmlformats.org/drawingml/2006/main" xmlns:pic="http://schemas.openxmlformats.org/drawingml/2006/picture">
-            <wp:extent cx="5940000" cy="3647368"/>
-            <wp:docPr id="2" name="Picture 2"/>
+            <wp:extent cx="5940000" cy="3751579"/>
+            <wp:docPr id="4" name="Picture 4"/>
             <wp:cNvGraphicFramePr>
               <a:graphicFrameLocks noChangeAspect="1"/>
             </wp:cNvGraphicFramePr>
@@ -818,7 +1127,7 @@
                     <pic:cNvPicPr/>
                   </pic:nvPicPr>
                   <pic:blipFill>
-                    <a:blip r:embed="rId10"/>
+                    <a:blip r:embed="rId12"/>
                     <a:stretch>
                       <a:fillRect/>
                     </a:stretch>
@@ -826,7 +1135,7 @@
                   <pic:spPr>
                     <a:xfrm>
                       <a:off x="0" y="0"/>
-                      <a:ext cx="5940000" cy="3647368"/>
+                      <a:ext cx="5940000" cy="3751579"/>
                     </a:xfrm>
                     <a:prstGeom prst="rect"/>
                   </pic:spPr>
@@ -863,7 +1172,7 @@
           <w:color w:val="0D253D"/>
           <w:sz w:val="21"/>
         </w:rPr>
-        <w:t>The Streamlit app offers tabs for PDF, Word, multiple images, camera, link and pasted text, three built-in sample documents (app terms, a rental agreement and an internship offer letter), a downloadable HTML report and a model-performance page. It runs on a laptop and on phones over the same Wi-Fi. All seven input types were tested end-to-end with automated browser tests, alongside a pytest suite for extraction, clause splitting, rules and scoring.</w:t>
+        <w:t>The Streamlit app offers tabs for PDF, Word, multiple images, camera, link and pasted text, three built-in sample documents (app terms, a rental agreement and an internship offer letter), a downloadable HTML report and a model-performance page. It runs on a laptop and on phones over the same Wi-Fi (HTTPS mode for the camera). PDF, scanned PDF, Word, multi-image, link and pasted-text inputs were tested end-to-end with automated browser tests; the camera path shares the image OCR code and is covered by a phone-style photo test. A pytest suite covers extraction, clause splitting, rules, scoring, HTML escaping and the app's behaviour.</w:t>
       </w:r>
     </w:p>
     <w:p>

</xml_diff>